<commit_message>
Refine document layout: re-align diagrams, balance code pagination, and expand technical descriptions
</commit_message>
<xml_diff>
--- a/BMS.docx
+++ b/BMS.docx
@@ -414,7 +414,7 @@
             </w:pPr>
             <w:fldSimple w:instr="PAGEREF sec_sdlc \# &quot;00&quot;">
               <w:r>
-                <w:t>07</w:t>
+                <w:t>08</w:t>
               </w:r>
             </w:fldSimple>
           </w:p>
@@ -490,7 +490,7 @@
             </w:pPr>
             <w:fldSimple w:instr="PAGEREF sec_phases \# &quot;00&quot;">
               <w:r>
-                <w:t>08</w:t>
+                <w:t>09</w:t>
               </w:r>
             </w:fldSimple>
           </w:p>
@@ -566,7 +566,7 @@
             </w:pPr>
             <w:fldSimple w:instr="PAGEREF sec_flowchart \# &quot;00&quot;">
               <w:r>
-                <w:t>15</w:t>
+                <w:t>16</w:t>
               </w:r>
             </w:fldSimple>
           </w:p>
@@ -642,7 +642,7 @@
             </w:pPr>
             <w:fldSimple w:instr="PAGEREF sec_sourcecode \# &quot;00&quot;">
               <w:r>
-                <w:t>17</w:t>
+                <w:t>18</w:t>
               </w:r>
             </w:fldSimple>
           </w:p>
@@ -718,7 +718,7 @@
             </w:pPr>
             <w:fldSimple w:instr="PAGEREF sec_output \# &quot;00&quot;">
               <w:r>
-                <w:t>23</w:t>
+                <w:t>25</w:t>
               </w:r>
             </w:fldSimple>
           </w:p>
@@ -794,7 +794,7 @@
             </w:pPr>
             <w:fldSimple w:instr="PAGEREF sec_testing \# &quot;00&quot;">
               <w:r>
-                <w:t>29</w:t>
+                <w:t>31</w:t>
               </w:r>
             </w:fldSimple>
           </w:p>
@@ -870,7 +870,7 @@
             </w:pPr>
             <w:fldSimple w:instr="PAGEREF sec_hardware \# &quot;00&quot;">
               <w:r>
-                <w:t>32</w:t>
+                <w:t>34</w:t>
               </w:r>
             </w:fldSimple>
           </w:p>
@@ -946,7 +946,7 @@
             </w:pPr>
             <w:fldSimple w:instr="PAGEREF sec_installation \# &quot;00&quot;">
               <w:r>
-                <w:t>33</w:t>
+                <w:t>35</w:t>
               </w:r>
             </w:fldSimple>
           </w:p>
@@ -1022,7 +1022,7 @@
             </w:pPr>
             <w:fldSimple w:instr="PAGEREF sec_bibliography \# &quot;00&quot;">
               <w:r>
-                <w:t>34</w:t>
+                <w:t>36</w:t>
               </w:r>
             </w:fldSimple>
           </w:p>
@@ -2405,278 +2405,6 @@
       </w:r>
     </w:p>
     <w:p>
-      <w:r>
-        <w:br w:type="page"/>
-      </w:r>
-    </w:p>
-    <w:p>
-      <w:pPr>
-        <w:keepNext/>
-        <w:spacing w:before="200" w:after="120"/>
-        <w:jc w:val="left"/>
-        <w:pBdr>
-          <w:bottom w:val="single" w:sz="6" w:space="4" w:color="000000"/>
-        </w:pBdr>
-      </w:pPr>
-      <w:r>
-        <w:rPr>
-          <w:rFonts w:ascii="Times New Roman" w:hAnsi="Times New Roman"/>
-          <w:b/>
-          <w:color w:val="000000"/>
-          <w:sz w:val="27"/>
-        </w:rPr>
-        <w:t>DATABASE DESIGN &amp; ENTITY-RELATIONSHIP (ER) MODELING</w:t>
-      </w:r>
-    </w:p>
-    <w:p>
-      <w:pPr>
-        <w:spacing w:before="0" w:after="120" w:line="300" w:lineRule="auto"/>
-        <w:jc w:val="both"/>
-      </w:pPr>
-      <w:r>
-        <w:rPr>
-          <w:rFonts w:ascii="Times New Roman" w:hAnsi="Times New Roman"/>
-          <w:color w:val="000000"/>
-          <w:sz w:val="24"/>
-        </w:rPr>
-        <w:t>The relational database schema is structured into three normalized tables designed to minimize redundancy while preserving data relationships. The database is titled 'bank' in MySQL.</w:t>
-      </w:r>
-    </w:p>
-    <w:p>
-      <w:pPr>
-        <w:spacing w:before="0" w:after="120" w:line="300" w:lineRule="auto"/>
-        <w:jc w:val="both"/>
-      </w:pPr>
-      <w:r>
-        <w:rPr>
-          <w:rFonts w:ascii="Times New Roman" w:hAnsi="Times New Roman"/>
-          <w:b/>
-          <w:color w:val="000000"/>
-          <w:sz w:val="24"/>
-        </w:rPr>
-        <w:t xml:space="preserve">• </w:t>
-      </w:r>
-      <w:r>
-        <w:rPr>
-          <w:rFonts w:ascii="Times New Roman" w:hAnsi="Times New Roman"/>
-          <w:color w:val="000000"/>
-          <w:sz w:val="24"/>
-        </w:rPr>
-        <w:t>Table 1: user_table — Stores operator authentication credentials.</w:t>
-      </w:r>
-    </w:p>
-    <w:p>
-      <w:pPr>
-        <w:pStyle w:val="ListBullet"/>
-        <w:spacing w:before="0" w:after="80" w:line="300" w:lineRule="auto"/>
-        <w:jc w:val="both"/>
-      </w:pPr>
-      <w:r>
-        <w:rPr>
-          <w:rFonts w:ascii="Times New Roman" w:hAnsi="Times New Roman"/>
-          <w:color w:val="000000"/>
-          <w:sz w:val="24"/>
-        </w:rPr>
-        <w:t>username VARCHAR(25) PRIMARY KEY — Unique username for system access.</w:t>
-      </w:r>
-    </w:p>
-    <w:p>
-      <w:pPr>
-        <w:pStyle w:val="ListBullet"/>
-        <w:spacing w:before="0" w:after="80" w:line="300" w:lineRule="auto"/>
-        <w:jc w:val="both"/>
-      </w:pPr>
-      <w:r>
-        <w:rPr>
-          <w:rFonts w:ascii="Times New Roman" w:hAnsi="Times New Roman"/>
-          <w:color w:val="000000"/>
-          <w:sz w:val="24"/>
-        </w:rPr>
-        <w:t>passwrd VARCHAR(25) NOT NULL — 4-digit security PIN.</w:t>
-      </w:r>
-    </w:p>
-    <w:p>
-      <w:pPr>
-        <w:spacing w:before="0" w:after="120" w:line="300" w:lineRule="auto"/>
-        <w:jc w:val="both"/>
-      </w:pPr>
-      <w:r>
-        <w:rPr>
-          <w:rFonts w:ascii="Times New Roman" w:hAnsi="Times New Roman"/>
-          <w:b/>
-          <w:color w:val="000000"/>
-          <w:sz w:val="24"/>
-        </w:rPr>
-        <w:t xml:space="preserve">• </w:t>
-      </w:r>
-      <w:r>
-        <w:rPr>
-          <w:rFonts w:ascii="Times New Roman" w:hAnsi="Times New Roman"/>
-          <w:color w:val="000000"/>
-          <w:sz w:val="24"/>
-        </w:rPr>
-        <w:t>Table 2: customer_details — Stores profile and financial state of account holders.</w:t>
-      </w:r>
-    </w:p>
-    <w:p>
-      <w:pPr>
-        <w:pStyle w:val="ListBullet"/>
-        <w:spacing w:before="0" w:after="80" w:line="300" w:lineRule="auto"/>
-        <w:jc w:val="both"/>
-      </w:pPr>
-      <w:r>
-        <w:rPr>
-          <w:rFonts w:ascii="Times New Roman" w:hAnsi="Times New Roman"/>
-          <w:color w:val="000000"/>
-          <w:sz w:val="24"/>
-        </w:rPr>
-        <w:t>acct_no INT PRIMARY KEY — Unique primary key identifying the bank account.</w:t>
-      </w:r>
-    </w:p>
-    <w:p>
-      <w:pPr>
-        <w:pStyle w:val="ListBullet"/>
-        <w:spacing w:before="0" w:after="80" w:line="300" w:lineRule="auto"/>
-        <w:jc w:val="both"/>
-      </w:pPr>
-      <w:r>
-        <w:rPr>
-          <w:rFonts w:ascii="Times New Roman" w:hAnsi="Times New Roman"/>
-          <w:color w:val="000000"/>
-          <w:sz w:val="24"/>
-        </w:rPr>
-        <w:t>acct_name VARCHAR(25) — Full legal name of the account holder.</w:t>
-      </w:r>
-    </w:p>
-    <w:p>
-      <w:pPr>
-        <w:pStyle w:val="ListBullet"/>
-        <w:spacing w:before="0" w:after="80" w:line="300" w:lineRule="auto"/>
-        <w:jc w:val="both"/>
-      </w:pPr>
-      <w:r>
-        <w:rPr>
-          <w:rFonts w:ascii="Times New Roman" w:hAnsi="Times New Roman"/>
-          <w:color w:val="000000"/>
-          <w:sz w:val="24"/>
-        </w:rPr>
-        <w:t>phone_no BIGINT — Customer contact number.</w:t>
-      </w:r>
-    </w:p>
-    <w:p>
-      <w:pPr>
-        <w:pStyle w:val="ListBullet"/>
-        <w:spacing w:before="0" w:after="80" w:line="300" w:lineRule="auto"/>
-        <w:jc w:val="both"/>
-      </w:pPr>
-      <w:r>
-        <w:rPr>
-          <w:rFonts w:ascii="Times New Roman" w:hAnsi="Times New Roman"/>
-          <w:color w:val="000000"/>
-          <w:sz w:val="24"/>
-        </w:rPr>
-        <w:t>address VARCHAR(50) — Place / residential city.</w:t>
-      </w:r>
-    </w:p>
-    <w:p>
-      <w:pPr>
-        <w:pStyle w:val="ListBullet"/>
-        <w:spacing w:before="0" w:after="80" w:line="300" w:lineRule="auto"/>
-        <w:jc w:val="both"/>
-      </w:pPr>
-      <w:r>
-        <w:rPr>
-          <w:rFonts w:ascii="Times New Roman" w:hAnsi="Times New Roman"/>
-          <w:color w:val="000000"/>
-          <w:sz w:val="24"/>
-        </w:rPr>
-        <w:t>cr_amt FLOAT — Current balance credit amount.</w:t>
-      </w:r>
-    </w:p>
-    <w:p>
-      <w:pPr>
-        <w:spacing w:before="0" w:after="120" w:line="300" w:lineRule="auto"/>
-        <w:jc w:val="both"/>
-      </w:pPr>
-      <w:r>
-        <w:rPr>
-          <w:rFonts w:ascii="Times New Roman" w:hAnsi="Times New Roman"/>
-          <w:b/>
-          <w:color w:val="000000"/>
-          <w:sz w:val="24"/>
-        </w:rPr>
-        <w:t xml:space="preserve">• </w:t>
-      </w:r>
-      <w:r>
-        <w:rPr>
-          <w:rFonts w:ascii="Times New Roman" w:hAnsi="Times New Roman"/>
-          <w:color w:val="000000"/>
-          <w:sz w:val="24"/>
-        </w:rPr>
-        <w:t>Table 3: transactions — Stores an append-only audit trail of financial operations.</w:t>
-      </w:r>
-    </w:p>
-    <w:p>
-      <w:pPr>
-        <w:pStyle w:val="ListBullet"/>
-        <w:spacing w:before="0" w:after="80" w:line="300" w:lineRule="auto"/>
-        <w:jc w:val="both"/>
-      </w:pPr>
-      <w:r>
-        <w:rPr>
-          <w:rFonts w:ascii="Times New Roman" w:hAnsi="Times New Roman"/>
-          <w:color w:val="000000"/>
-          <w:sz w:val="24"/>
-        </w:rPr>
-        <w:t>acct_no INT — Account number associated with the transaction (Foreign Key relationship).</w:t>
-      </w:r>
-    </w:p>
-    <w:p>
-      <w:pPr>
-        <w:pStyle w:val="ListBullet"/>
-        <w:spacing w:before="0" w:after="80" w:line="300" w:lineRule="auto"/>
-        <w:jc w:val="both"/>
-      </w:pPr>
-      <w:r>
-        <w:rPr>
-          <w:rFonts w:ascii="Times New Roman" w:hAnsi="Times New Roman"/>
-          <w:color w:val="000000"/>
-          <w:sz w:val="24"/>
-        </w:rPr>
-        <w:t>date DATE — Date timestamp of transaction execution.</w:t>
-      </w:r>
-    </w:p>
-    <w:p>
-      <w:pPr>
-        <w:pStyle w:val="ListBullet"/>
-        <w:spacing w:before="0" w:after="80" w:line="300" w:lineRule="auto"/>
-        <w:jc w:val="both"/>
-      </w:pPr>
-      <w:r>
-        <w:rPr>
-          <w:rFonts w:ascii="Times New Roman" w:hAnsi="Times New Roman"/>
-          <w:color w:val="000000"/>
-          <w:sz w:val="24"/>
-        </w:rPr>
-        <w:t>withdrawal_amt FLOAT — Amount debited (0 if deposit).</w:t>
-      </w:r>
-    </w:p>
-    <w:p>
-      <w:pPr>
-        <w:pStyle w:val="ListBullet"/>
-        <w:spacing w:before="0" w:after="80" w:line="300" w:lineRule="auto"/>
-        <w:jc w:val="both"/>
-      </w:pPr>
-      <w:r>
-        <w:rPr>
-          <w:rFonts w:ascii="Times New Roman" w:hAnsi="Times New Roman"/>
-          <w:color w:val="000000"/>
-          <w:sz w:val="24"/>
-        </w:rPr>
-        <w:t>amount_added FLOAT — Amount credited (0 if withdrawal).</w:t>
-      </w:r>
-    </w:p>
-    <w:p>
       <w:pPr>
         <w:keepNext/>
         <w:spacing w:before="120" w:after="80"/>
@@ -2685,7 +2413,7 @@
       <w:r>
         <w:drawing>
           <wp:inline xmlns:a="http://schemas.openxmlformats.org/drawingml/2006/main" xmlns:pic="http://schemas.openxmlformats.org/drawingml/2006/picture">
-            <wp:extent cx="4937760" cy="3291840"/>
+            <wp:extent cx="3200400" cy="2133600"/>
             <wp:docPr id="3" name="Picture 3"/>
             <wp:cNvGraphicFramePr>
               <a:graphicFrameLocks noChangeAspect="1"/>
@@ -2706,7 +2434,7 @@
                   <pic:spPr>
                     <a:xfrm>
                       <a:off x="0" y="0"/>
-                      <a:ext cx="4937760" cy="3291840"/>
+                      <a:ext cx="3200400" cy="2133600"/>
                     </a:xfrm>
                     <a:prstGeom prst="rect"/>
                   </pic:spPr>
@@ -2730,6 +2458,278 @@
           <w:sz w:val="21"/>
         </w:rPr>
         <w:t>Figure 5.1: Bank Management System Entity-Relationship (ER) Diagram</w:t>
+      </w:r>
+    </w:p>
+    <w:p>
+      <w:r>
+        <w:br w:type="page"/>
+      </w:r>
+    </w:p>
+    <w:p>
+      <w:pPr>
+        <w:keepNext/>
+        <w:spacing w:before="200" w:after="120"/>
+        <w:jc w:val="left"/>
+        <w:pBdr>
+          <w:bottom w:val="single" w:sz="6" w:space="4" w:color="000000"/>
+        </w:pBdr>
+      </w:pPr>
+      <w:r>
+        <w:rPr>
+          <w:rFonts w:ascii="Times New Roman" w:hAnsi="Times New Roman"/>
+          <w:b/>
+          <w:color w:val="000000"/>
+          <w:sz w:val="27"/>
+        </w:rPr>
+        <w:t>DATABASE DESIGN &amp; ENTITY-RELATIONSHIP (ER) MODELING</w:t>
+      </w:r>
+    </w:p>
+    <w:p>
+      <w:pPr>
+        <w:spacing w:before="0" w:after="120" w:line="300" w:lineRule="auto"/>
+        <w:jc w:val="both"/>
+      </w:pPr>
+      <w:r>
+        <w:rPr>
+          <w:rFonts w:ascii="Times New Roman" w:hAnsi="Times New Roman"/>
+          <w:color w:val="000000"/>
+          <w:sz w:val="24"/>
+        </w:rPr>
+        <w:t>The relational database schema is structured into three normalized tables designed to minimize redundancy while preserving data relationships. The database is titled 'bank' in MySQL.</w:t>
+      </w:r>
+    </w:p>
+    <w:p>
+      <w:pPr>
+        <w:spacing w:before="0" w:after="120" w:line="300" w:lineRule="auto"/>
+        <w:jc w:val="both"/>
+      </w:pPr>
+      <w:r>
+        <w:rPr>
+          <w:rFonts w:ascii="Times New Roman" w:hAnsi="Times New Roman"/>
+          <w:b/>
+          <w:color w:val="000000"/>
+          <w:sz w:val="24"/>
+        </w:rPr>
+        <w:t xml:space="preserve">• </w:t>
+      </w:r>
+      <w:r>
+        <w:rPr>
+          <w:rFonts w:ascii="Times New Roman" w:hAnsi="Times New Roman"/>
+          <w:color w:val="000000"/>
+          <w:sz w:val="24"/>
+        </w:rPr>
+        <w:t>Table 1: user_table — Stores operator authentication credentials.</w:t>
+      </w:r>
+    </w:p>
+    <w:p>
+      <w:pPr>
+        <w:pStyle w:val="ListBullet"/>
+        <w:spacing w:before="0" w:after="80" w:line="300" w:lineRule="auto"/>
+        <w:jc w:val="both"/>
+      </w:pPr>
+      <w:r>
+        <w:rPr>
+          <w:rFonts w:ascii="Times New Roman" w:hAnsi="Times New Roman"/>
+          <w:color w:val="000000"/>
+          <w:sz w:val="24"/>
+        </w:rPr>
+        <w:t>username VARCHAR(25) PRIMARY KEY — Unique username for system access.</w:t>
+      </w:r>
+    </w:p>
+    <w:p>
+      <w:pPr>
+        <w:pStyle w:val="ListBullet"/>
+        <w:spacing w:before="0" w:after="80" w:line="300" w:lineRule="auto"/>
+        <w:jc w:val="both"/>
+      </w:pPr>
+      <w:r>
+        <w:rPr>
+          <w:rFonts w:ascii="Times New Roman" w:hAnsi="Times New Roman"/>
+          <w:color w:val="000000"/>
+          <w:sz w:val="24"/>
+        </w:rPr>
+        <w:t>passwrd VARCHAR(25) NOT NULL — 4-digit security PIN.</w:t>
+      </w:r>
+    </w:p>
+    <w:p>
+      <w:pPr>
+        <w:spacing w:before="0" w:after="120" w:line="300" w:lineRule="auto"/>
+        <w:jc w:val="both"/>
+      </w:pPr>
+      <w:r>
+        <w:rPr>
+          <w:rFonts w:ascii="Times New Roman" w:hAnsi="Times New Roman"/>
+          <w:b/>
+          <w:color w:val="000000"/>
+          <w:sz w:val="24"/>
+        </w:rPr>
+        <w:t xml:space="preserve">• </w:t>
+      </w:r>
+      <w:r>
+        <w:rPr>
+          <w:rFonts w:ascii="Times New Roman" w:hAnsi="Times New Roman"/>
+          <w:color w:val="000000"/>
+          <w:sz w:val="24"/>
+        </w:rPr>
+        <w:t>Table 2: customer_details — Stores profile and financial state of account holders.</w:t>
+      </w:r>
+    </w:p>
+    <w:p>
+      <w:pPr>
+        <w:pStyle w:val="ListBullet"/>
+        <w:spacing w:before="0" w:after="80" w:line="300" w:lineRule="auto"/>
+        <w:jc w:val="both"/>
+      </w:pPr>
+      <w:r>
+        <w:rPr>
+          <w:rFonts w:ascii="Times New Roman" w:hAnsi="Times New Roman"/>
+          <w:color w:val="000000"/>
+          <w:sz w:val="24"/>
+        </w:rPr>
+        <w:t>acct_no INT PRIMARY KEY — Unique primary key identifying the bank account.</w:t>
+      </w:r>
+    </w:p>
+    <w:p>
+      <w:pPr>
+        <w:pStyle w:val="ListBullet"/>
+        <w:spacing w:before="0" w:after="80" w:line="300" w:lineRule="auto"/>
+        <w:jc w:val="both"/>
+      </w:pPr>
+      <w:r>
+        <w:rPr>
+          <w:rFonts w:ascii="Times New Roman" w:hAnsi="Times New Roman"/>
+          <w:color w:val="000000"/>
+          <w:sz w:val="24"/>
+        </w:rPr>
+        <w:t>acct_name VARCHAR(25) — Full legal name of the account holder.</w:t>
+      </w:r>
+    </w:p>
+    <w:p>
+      <w:pPr>
+        <w:pStyle w:val="ListBullet"/>
+        <w:spacing w:before="0" w:after="80" w:line="300" w:lineRule="auto"/>
+        <w:jc w:val="both"/>
+      </w:pPr>
+      <w:r>
+        <w:rPr>
+          <w:rFonts w:ascii="Times New Roman" w:hAnsi="Times New Roman"/>
+          <w:color w:val="000000"/>
+          <w:sz w:val="24"/>
+        </w:rPr>
+        <w:t>phone_no BIGINT — Customer contact number.</w:t>
+      </w:r>
+    </w:p>
+    <w:p>
+      <w:pPr>
+        <w:pStyle w:val="ListBullet"/>
+        <w:spacing w:before="0" w:after="80" w:line="300" w:lineRule="auto"/>
+        <w:jc w:val="both"/>
+      </w:pPr>
+      <w:r>
+        <w:rPr>
+          <w:rFonts w:ascii="Times New Roman" w:hAnsi="Times New Roman"/>
+          <w:color w:val="000000"/>
+          <w:sz w:val="24"/>
+        </w:rPr>
+        <w:t>address VARCHAR(50) — Place / residential city.</w:t>
+      </w:r>
+    </w:p>
+    <w:p>
+      <w:pPr>
+        <w:pStyle w:val="ListBullet"/>
+        <w:spacing w:before="0" w:after="80" w:line="300" w:lineRule="auto"/>
+        <w:jc w:val="both"/>
+      </w:pPr>
+      <w:r>
+        <w:rPr>
+          <w:rFonts w:ascii="Times New Roman" w:hAnsi="Times New Roman"/>
+          <w:color w:val="000000"/>
+          <w:sz w:val="24"/>
+        </w:rPr>
+        <w:t>cr_amt FLOAT — Current balance credit amount.</w:t>
+      </w:r>
+    </w:p>
+    <w:p>
+      <w:pPr>
+        <w:spacing w:before="0" w:after="120" w:line="300" w:lineRule="auto"/>
+        <w:jc w:val="both"/>
+      </w:pPr>
+      <w:r>
+        <w:rPr>
+          <w:rFonts w:ascii="Times New Roman" w:hAnsi="Times New Roman"/>
+          <w:b/>
+          <w:color w:val="000000"/>
+          <w:sz w:val="24"/>
+        </w:rPr>
+        <w:t xml:space="preserve">• </w:t>
+      </w:r>
+      <w:r>
+        <w:rPr>
+          <w:rFonts w:ascii="Times New Roman" w:hAnsi="Times New Roman"/>
+          <w:color w:val="000000"/>
+          <w:sz w:val="24"/>
+        </w:rPr>
+        <w:t>Table 3: transactions — Stores an append-only audit trail of financial operations.</w:t>
+      </w:r>
+    </w:p>
+    <w:p>
+      <w:pPr>
+        <w:pStyle w:val="ListBullet"/>
+        <w:spacing w:before="0" w:after="80" w:line="300" w:lineRule="auto"/>
+        <w:jc w:val="both"/>
+      </w:pPr>
+      <w:r>
+        <w:rPr>
+          <w:rFonts w:ascii="Times New Roman" w:hAnsi="Times New Roman"/>
+          <w:color w:val="000000"/>
+          <w:sz w:val="24"/>
+        </w:rPr>
+        <w:t>acct_no INT — Account number associated with the transaction (Foreign Key relationship).</w:t>
+      </w:r>
+    </w:p>
+    <w:p>
+      <w:pPr>
+        <w:pStyle w:val="ListBullet"/>
+        <w:spacing w:before="0" w:after="80" w:line="300" w:lineRule="auto"/>
+        <w:jc w:val="both"/>
+      </w:pPr>
+      <w:r>
+        <w:rPr>
+          <w:rFonts w:ascii="Times New Roman" w:hAnsi="Times New Roman"/>
+          <w:color w:val="000000"/>
+          <w:sz w:val="24"/>
+        </w:rPr>
+        <w:t>date DATE — Date timestamp of transaction execution.</w:t>
+      </w:r>
+    </w:p>
+    <w:p>
+      <w:pPr>
+        <w:pStyle w:val="ListBullet"/>
+        <w:spacing w:before="0" w:after="80" w:line="300" w:lineRule="auto"/>
+        <w:jc w:val="both"/>
+      </w:pPr>
+      <w:r>
+        <w:rPr>
+          <w:rFonts w:ascii="Times New Roman" w:hAnsi="Times New Roman"/>
+          <w:color w:val="000000"/>
+          <w:sz w:val="24"/>
+        </w:rPr>
+        <w:t>withdrawal_amt FLOAT — Amount debited (0 if deposit).</w:t>
+      </w:r>
+    </w:p>
+    <w:p>
+      <w:pPr>
+        <w:pStyle w:val="ListBullet"/>
+        <w:spacing w:before="0" w:after="80" w:line="300" w:lineRule="auto"/>
+        <w:jc w:val="both"/>
+      </w:pPr>
+      <w:r>
+        <w:rPr>
+          <w:rFonts w:ascii="Times New Roman" w:hAnsi="Times New Roman"/>
+          <w:color w:val="000000"/>
+          <w:sz w:val="24"/>
+        </w:rPr>
+        <w:t>amount_added FLOAT — Amount credited (0 if withdrawal).</w:t>
       </w:r>
     </w:p>
     <w:p>
@@ -2884,20 +2884,6 @@
       </w:r>
     </w:p>
     <w:p>
-      <w:pPr>
-        <w:spacing w:before="0" w:after="120" w:line="300" w:lineRule="auto"/>
-        <w:jc w:val="both"/>
-      </w:pPr>
-      <w:r>
-        <w:rPr>
-          <w:rFonts w:ascii="Times New Roman" w:hAnsi="Times New Roman"/>
-          <w:color w:val="000000"/>
-          <w:sz w:val="24"/>
-        </w:rPr>
-        <w:t>Collectively, these standards produced a coherent, maintainable codebase in which every function carries a single, well-defined responsibility. This discipline proved decisive during the later integration and testing phase: defects could be traced to a specific module in minutes rather than hours, and the complete source tree remained small enough to be reviewed end-to-end by an examiner in a single sitting.</w:t>
-      </w:r>
-    </w:p>
-    <w:p>
       <w:r>
         <w:br w:type="page"/>
       </w:r>
@@ -3323,7 +3309,7 @@
       <w:r>
         <w:drawing>
           <wp:inline xmlns:a="http://schemas.openxmlformats.org/drawingml/2006/main" xmlns:pic="http://schemas.openxmlformats.org/drawingml/2006/picture">
-            <wp:extent cx="4572000" cy="6461471"/>
+            <wp:extent cx="3383280" cy="4781489"/>
             <wp:docPr id="4" name="Picture 4"/>
             <wp:cNvGraphicFramePr>
               <a:graphicFrameLocks noChangeAspect="1"/>
@@ -3344,7 +3330,7 @@
                   <pic:spPr>
                     <a:xfrm>
                       <a:off x="0" y="0"/>
-                      <a:ext cx="4572000" cy="6461471"/>
+                      <a:ext cx="3383280" cy="4781489"/>
                     </a:xfrm>
                     <a:prstGeom prst="rect"/>
                   </pic:spPr>
@@ -3559,10 +3545,16 @@
               <w:bottom w:val="single" w:sz="6" w:space="0" w:color="000000"/>
               <w:right w:val="single" w:sz="6" w:space="0" w:color="000000"/>
             </w:tcBorders>
+            <w:tcMar>
+              <w:top w:w="60" w:type="dxa"/>
+              <w:bottom w:w="60" w:type="dxa"/>
+              <w:left w:w="120" w:type="dxa"/>
+              <w:right w:w="120" w:type="dxa"/>
+            </w:tcMar>
           </w:tcPr>
           <w:p>
             <w:pPr>
-              <w:spacing w:before="80" w:after="80" w:line="269" w:lineRule="auto"/>
+              <w:spacing w:before="40" w:after="40" w:line="269" w:lineRule="auto"/>
             </w:pPr>
             <w:r>
               <w:rPr>
@@ -3606,11 +3598,6 @@
         </w:tc>
       </w:tr>
     </w:tbl>
-    <w:p>
-      <w:pPr>
-        <w:spacing w:before="0" w:after="80"/>
-      </w:pPr>
-    </w:p>
     <w:p>
       <w:pPr>
         <w:spacing w:before="0" w:after="120" w:line="300" w:lineRule="auto"/>
@@ -3647,10 +3634,16 @@
               <w:bottom w:val="single" w:sz="6" w:space="0" w:color="000000"/>
               <w:right w:val="single" w:sz="6" w:space="0" w:color="000000"/>
             </w:tcBorders>
+            <w:tcMar>
+              <w:top w:w="60" w:type="dxa"/>
+              <w:bottom w:w="60" w:type="dxa"/>
+              <w:left w:w="120" w:type="dxa"/>
+              <w:right w:w="120" w:type="dxa"/>
+            </w:tcMar>
           </w:tcPr>
           <w:p>
             <w:pPr>
-              <w:spacing w:before="80" w:after="80" w:line="269" w:lineRule="auto"/>
+              <w:spacing w:before="40" w:after="40" w:line="269" w:lineRule="auto"/>
             </w:pPr>
             <w:r>
               <w:rPr>
@@ -3688,11 +3681,6 @@
         </w:tc>
       </w:tr>
     </w:tbl>
-    <w:p>
-      <w:pPr>
-        <w:spacing w:before="0" w:after="80"/>
-      </w:pPr>
-    </w:p>
     <w:p>
       <w:pPr>
         <w:spacing w:before="0" w:after="120" w:line="300" w:lineRule="auto"/>
@@ -3729,10 +3717,16 @@
               <w:bottom w:val="single" w:sz="6" w:space="0" w:color="000000"/>
               <w:right w:val="single" w:sz="6" w:space="0" w:color="000000"/>
             </w:tcBorders>
+            <w:tcMar>
+              <w:top w:w="60" w:type="dxa"/>
+              <w:bottom w:w="60" w:type="dxa"/>
+              <w:left w:w="120" w:type="dxa"/>
+              <w:right w:w="120" w:type="dxa"/>
+            </w:tcMar>
           </w:tcPr>
           <w:p>
             <w:pPr>
-              <w:spacing w:before="80" w:after="80" w:line="269" w:lineRule="auto"/>
+              <w:spacing w:before="40" w:after="40" w:line="269" w:lineRule="auto"/>
             </w:pPr>
             <w:r>
               <w:rPr>
@@ -3774,11 +3768,6 @@
         </w:tc>
       </w:tr>
     </w:tbl>
-    <w:p>
-      <w:pPr>
-        <w:spacing w:before="0" w:after="80"/>
-      </w:pPr>
-    </w:p>
     <w:p>
       <w:r>
         <w:br w:type="page"/>
@@ -3814,7 +3803,21 @@
           <w:color w:val="000000"/>
           <w:sz w:val="24"/>
         </w:rPr>
-        <w:t>This script serves as the primary gateway into the application, prompting the user for registration or login.</w:t>
+        <w:t>The main_bank.py script acts as the master authentication gatekeeper and security boundary for the Bank Management System. Upon execution, the module initializes runtime dependencies, connects to the local MySQL database instance using host, user, and password parameters, and initializes an operational cursor for transactional communication.</w:t>
+      </w:r>
+    </w:p>
+    <w:p>
+      <w:pPr>
+        <w:spacing w:before="0" w:after="120" w:line="300" w:lineRule="auto"/>
+        <w:jc w:val="both"/>
+      </w:pPr>
+      <w:r>
+        <w:rPr>
+          <w:rFonts w:ascii="Times New Roman" w:hAnsi="Times New Roman"/>
+          <w:color w:val="000000"/>
+          <w:sz w:val="24"/>
+        </w:rPr>
+        <w:t>Part 1 implements the application bootstrapper and the operator onboarding sequence. It presents an interactive terminal interface that timestamps system entry using Python's standard datetime module. When Option 1 (Register) is selected, the routine prompts the operator for a new username and a mandatory 4-digit security PIN. It validates the credentials and executes an INSERT query against the user_table relation, followed by an immediate conn.commit() to ensure persistent ACID storage before launching the main banking menu.</w:t>
       </w:r>
     </w:p>
     <w:tbl>
@@ -3839,10 +3842,16 @@
               <w:bottom w:val="single" w:sz="6" w:space="0" w:color="000000"/>
               <w:right w:val="single" w:sz="6" w:space="0" w:color="000000"/>
             </w:tcBorders>
+            <w:tcMar>
+              <w:top w:w="60" w:type="dxa"/>
+              <w:bottom w:w="60" w:type="dxa"/>
+              <w:left w:w="120" w:type="dxa"/>
+              <w:right w:w="120" w:type="dxa"/>
+            </w:tcMar>
           </w:tcPr>
           <w:p>
             <w:pPr>
-              <w:spacing w:before="80" w:after="80" w:line="269" w:lineRule="auto"/>
+              <w:spacing w:before="40" w:after="40" w:line="269" w:lineRule="auto"/>
             </w:pPr>
             <w:r>
               <w:rPr>
@@ -3918,11 +3927,6 @@
         </w:tc>
       </w:tr>
     </w:tbl>
-    <w:p>
-      <w:pPr>
-        <w:spacing w:before="0" w:after="80"/>
-      </w:pPr>
-    </w:p>
     <w:p>
       <w:r>
         <w:br w:type="page"/>
@@ -3983,10 +3987,16 @@
               <w:bottom w:val="single" w:sz="6" w:space="0" w:color="000000"/>
               <w:right w:val="single" w:sz="6" w:space="0" w:color="000000"/>
             </w:tcBorders>
+            <w:tcMar>
+              <w:top w:w="60" w:type="dxa"/>
+              <w:bottom w:w="60" w:type="dxa"/>
+              <w:left w:w="120" w:type="dxa"/>
+              <w:right w:w="120" w:type="dxa"/>
+            </w:tcMar>
           </w:tcPr>
           <w:p>
             <w:pPr>
-              <w:spacing w:before="80" w:after="80" w:line="269" w:lineRule="auto"/>
+              <w:spacing w:before="40" w:after="40" w:line="269" w:lineRule="auto"/>
             </w:pPr>
             <w:r>
               <w:rPr>
@@ -4038,11 +4048,6 @@
         </w:tc>
       </w:tr>
     </w:tbl>
-    <w:p>
-      <w:pPr>
-        <w:spacing w:before="0" w:after="80"/>
-      </w:pPr>
-    </w:p>
     <w:p>
       <w:r>
         <w:br w:type="page"/>
@@ -4103,10 +4108,16 @@
               <w:bottom w:val="single" w:sz="6" w:space="0" w:color="000000"/>
               <w:right w:val="single" w:sz="6" w:space="0" w:color="000000"/>
             </w:tcBorders>
+            <w:tcMar>
+              <w:top w:w="60" w:type="dxa"/>
+              <w:bottom w:w="60" w:type="dxa"/>
+              <w:left w:w="120" w:type="dxa"/>
+              <w:right w:w="120" w:type="dxa"/>
+            </w:tcMar>
           </w:tcPr>
           <w:p>
             <w:pPr>
-              <w:spacing w:before="80" w:after="80" w:line="269" w:lineRule="auto"/>
+              <w:spacing w:before="40" w:after="40" w:line="269" w:lineRule="auto"/>
             </w:pPr>
             <w:r>
               <w:rPr>
@@ -4185,11 +4196,6 @@
         </w:tc>
       </w:tr>
     </w:tbl>
-    <w:p>
-      <w:pPr>
-        <w:spacing w:before="0" w:after="80"/>
-      </w:pPr>
-    </w:p>
     <w:p>
       <w:r>
         <w:br w:type="page"/>
@@ -4250,10 +4256,16 @@
               <w:bottom w:val="single" w:sz="6" w:space="0" w:color="000000"/>
               <w:right w:val="single" w:sz="6" w:space="0" w:color="000000"/>
             </w:tcBorders>
+            <w:tcMar>
+              <w:top w:w="60" w:type="dxa"/>
+              <w:bottom w:w="60" w:type="dxa"/>
+              <w:left w:w="120" w:type="dxa"/>
+              <w:right w:w="120" w:type="dxa"/>
+            </w:tcMar>
           </w:tcPr>
           <w:p>
             <w:pPr>
-              <w:spacing w:before="80" w:after="80" w:line="269" w:lineRule="auto"/>
+              <w:spacing w:before="40" w:after="40" w:line="269" w:lineRule="auto"/>
             </w:pPr>
             <w:r>
               <w:rPr>
@@ -4342,11 +4354,6 @@
         </w:tc>
       </w:tr>
     </w:tbl>
-    <w:p>
-      <w:pPr>
-        <w:spacing w:before="0" w:after="80"/>
-      </w:pPr>
-    </w:p>
     <w:p>
       <w:r>
         <w:br w:type="page"/>
@@ -4382,7 +4389,7 @@
           <w:color w:val="000000"/>
           <w:sz w:val="24"/>
         </w:rPr>
-        <w:t>Continuation of menu.py covering Customer Inquiries, Transaction Logs, Account Deletion, and Quit. These final routines close the operational lifecycle: they present read-only views of customer and transaction data, enforce a confirmed deletion sequence that purges both profile and audit records, and provide a controlled exit path that terminates the session cleanly without leaving the cursor or connection open.</w:t>
+        <w:t>Continuation of menu.py covering Customer Inquiries, Transaction Statement Logs, Account Termination, and Session Exit.</w:t>
       </w:r>
     </w:p>
     <w:tbl>
@@ -4407,16 +4414,22 @@
               <w:bottom w:val="single" w:sz="6" w:space="0" w:color="000000"/>
               <w:right w:val="single" w:sz="6" w:space="0" w:color="000000"/>
             </w:tcBorders>
+            <w:tcMar>
+              <w:top w:w="60" w:type="dxa"/>
+              <w:bottom w:w="60" w:type="dxa"/>
+              <w:left w:w="120" w:type="dxa"/>
+              <w:right w:w="120" w:type="dxa"/>
+            </w:tcMar>
           </w:tcPr>
           <w:p>
             <w:pPr>
-              <w:spacing w:before="80" w:after="80" w:line="269" w:lineRule="auto"/>
+              <w:spacing w:before="40" w:after="40" w:line="240" w:lineRule="auto"/>
             </w:pPr>
             <w:r>
               <w:rPr>
                 <w:rFonts w:ascii="Consolas" w:hAnsi="Consolas"/>
                 <w:color w:val="000000"/>
-                <w:sz w:val="19"/>
+                <w:sz w:val="15"/>
               </w:rPr>
               <w:t xml:space="preserve">        # Feature 3: View Customer Details</w:t>
               <w:br/>
@@ -4539,11 +4552,6 @@
         </w:tc>
       </w:tr>
     </w:tbl>
-    <w:p>
-      <w:pPr>
-        <w:spacing w:before="0" w:after="80"/>
-      </w:pPr>
-    </w:p>
     <w:p>
       <w:r>
         <w:br w:type="page"/>
@@ -4625,10 +4633,16 @@
               <w:bottom w:val="single" w:sz="6" w:space="0" w:color="000000"/>
               <w:right w:val="single" w:sz="6" w:space="0" w:color="000000"/>
             </w:tcBorders>
+            <w:tcMar>
+              <w:top w:w="60" w:type="dxa"/>
+              <w:bottom w:w="60" w:type="dxa"/>
+              <w:left w:w="120" w:type="dxa"/>
+              <w:right w:w="120" w:type="dxa"/>
+            </w:tcMar>
           </w:tcPr>
           <w:p>
             <w:pPr>
-              <w:spacing w:before="80" w:after="80" w:line="269" w:lineRule="auto"/>
+              <w:spacing w:before="40" w:after="40" w:line="269" w:lineRule="auto"/>
             </w:pPr>
             <w:r>
               <w:rPr>
@@ -4661,11 +4675,6 @@
         </w:tc>
       </w:tr>
     </w:tbl>
-    <w:p>
-      <w:pPr>
-        <w:spacing w:before="0" w:after="80"/>
-      </w:pPr>
-    </w:p>
     <w:p>
       <w:r>
         <w:br w:type="page"/>
@@ -4726,10 +4735,16 @@
               <w:bottom w:val="single" w:sz="6" w:space="0" w:color="000000"/>
               <w:right w:val="single" w:sz="6" w:space="0" w:color="000000"/>
             </w:tcBorders>
+            <w:tcMar>
+              <w:top w:w="60" w:type="dxa"/>
+              <w:bottom w:w="60" w:type="dxa"/>
+              <w:left w:w="120" w:type="dxa"/>
+              <w:right w:w="120" w:type="dxa"/>
+            </w:tcMar>
           </w:tcPr>
           <w:p>
             <w:pPr>
-              <w:spacing w:before="80" w:after="80" w:line="269" w:lineRule="auto"/>
+              <w:spacing w:before="40" w:after="40" w:line="269" w:lineRule="auto"/>
             </w:pPr>
             <w:r>
               <w:rPr>
@@ -4782,11 +4797,6 @@
         </w:tc>
       </w:tr>
     </w:tbl>
-    <w:p>
-      <w:pPr>
-        <w:spacing w:before="0" w:after="80"/>
-      </w:pPr>
-    </w:p>
     <w:p>
       <w:r>
         <w:br w:type="page"/>
@@ -4847,10 +4857,16 @@
               <w:bottom w:val="single" w:sz="6" w:space="0" w:color="000000"/>
               <w:right w:val="single" w:sz="6" w:space="0" w:color="000000"/>
             </w:tcBorders>
+            <w:tcMar>
+              <w:top w:w="60" w:type="dxa"/>
+              <w:bottom w:w="60" w:type="dxa"/>
+              <w:left w:w="120" w:type="dxa"/>
+              <w:right w:w="120" w:type="dxa"/>
+            </w:tcMar>
           </w:tcPr>
           <w:p>
             <w:pPr>
-              <w:spacing w:before="80" w:after="80" w:line="269" w:lineRule="auto"/>
+              <w:spacing w:before="40" w:after="40" w:line="269" w:lineRule="auto"/>
             </w:pPr>
             <w:r>
               <w:rPr>
@@ -4895,11 +4911,6 @@
         </w:tc>
       </w:tr>
     </w:tbl>
-    <w:p>
-      <w:pPr>
-        <w:spacing w:before="0" w:after="80"/>
-      </w:pPr>
-    </w:p>
     <w:p>
       <w:r>
         <w:br w:type="page"/>
@@ -4960,10 +4971,16 @@
               <w:bottom w:val="single" w:sz="6" w:space="0" w:color="000000"/>
               <w:right w:val="single" w:sz="6" w:space="0" w:color="000000"/>
             </w:tcBorders>
+            <w:tcMar>
+              <w:top w:w="60" w:type="dxa"/>
+              <w:bottom w:w="60" w:type="dxa"/>
+              <w:left w:w="120" w:type="dxa"/>
+              <w:right w:w="120" w:type="dxa"/>
+            </w:tcMar>
           </w:tcPr>
           <w:p>
             <w:pPr>
-              <w:spacing w:before="80" w:after="80" w:line="269" w:lineRule="auto"/>
+              <w:spacing w:before="40" w:after="40" w:line="269" w:lineRule="auto"/>
             </w:pPr>
             <w:r>
               <w:rPr>
@@ -5018,11 +5035,6 @@
         </w:tc>
       </w:tr>
     </w:tbl>
-    <w:p>
-      <w:pPr>
-        <w:spacing w:before="0" w:after="80"/>
-      </w:pPr>
-    </w:p>
     <w:p>
       <w:r>
         <w:br w:type="page"/>
@@ -5083,10 +5095,16 @@
               <w:bottom w:val="single" w:sz="6" w:space="0" w:color="000000"/>
               <w:right w:val="single" w:sz="6" w:space="0" w:color="000000"/>
             </w:tcBorders>
+            <w:tcMar>
+              <w:top w:w="60" w:type="dxa"/>
+              <w:bottom w:w="60" w:type="dxa"/>
+              <w:left w:w="120" w:type="dxa"/>
+              <w:right w:w="120" w:type="dxa"/>
+            </w:tcMar>
           </w:tcPr>
           <w:p>
             <w:pPr>
-              <w:spacing w:before="80" w:after="80" w:line="269" w:lineRule="auto"/>
+              <w:spacing w:before="40" w:after="40" w:line="269" w:lineRule="auto"/>
             </w:pPr>
             <w:r>
               <w:rPr>
@@ -5134,11 +5152,6 @@
         </w:tc>
       </w:tr>
     </w:tbl>
-    <w:p>
-      <w:pPr>
-        <w:spacing w:before="0" w:after="80"/>
-      </w:pPr>
-    </w:p>
     <w:p>
       <w:r>
         <w:br w:type="page"/>
@@ -5199,10 +5212,16 @@
               <w:bottom w:val="single" w:sz="6" w:space="0" w:color="000000"/>
               <w:right w:val="single" w:sz="6" w:space="0" w:color="000000"/>
             </w:tcBorders>
+            <w:tcMar>
+              <w:top w:w="60" w:type="dxa"/>
+              <w:bottom w:w="60" w:type="dxa"/>
+              <w:left w:w="120" w:type="dxa"/>
+              <w:right w:w="120" w:type="dxa"/>
+            </w:tcMar>
           </w:tcPr>
           <w:p>
             <w:pPr>
-              <w:spacing w:before="80" w:after="80" w:line="269" w:lineRule="auto"/>
+              <w:spacing w:before="40" w:after="40" w:line="269" w:lineRule="auto"/>
             </w:pPr>
             <w:r>
               <w:rPr>
@@ -5254,11 +5273,6 @@
         </w:tc>
       </w:tr>
     </w:tbl>
-    <w:p>
-      <w:pPr>
-        <w:spacing w:before="0" w:after="80"/>
-      </w:pPr>
-    </w:p>
     <w:p>
       <w:r>
         <w:br w:type="page"/>
@@ -8332,10 +8346,16 @@
               <w:bottom w:val="single" w:sz="6" w:space="0" w:color="000000"/>
               <w:right w:val="single" w:sz="6" w:space="0" w:color="000000"/>
             </w:tcBorders>
+            <w:tcMar>
+              <w:top w:w="60" w:type="dxa"/>
+              <w:bottom w:w="60" w:type="dxa"/>
+              <w:left w:w="120" w:type="dxa"/>
+              <w:right w:w="120" w:type="dxa"/>
+            </w:tcMar>
           </w:tcPr>
           <w:p>
             <w:pPr>
-              <w:spacing w:before="80" w:after="80" w:line="269" w:lineRule="auto"/>
+              <w:spacing w:before="40" w:after="40" w:line="269" w:lineRule="auto"/>
             </w:pPr>
             <w:r>
               <w:rPr>
@@ -8349,11 +8369,6 @@
         </w:tc>
       </w:tr>
     </w:tbl>
-    <w:p>
-      <w:pPr>
-        <w:spacing w:before="0" w:after="80"/>
-      </w:pPr>
-    </w:p>
     <w:p>
       <w:pPr>
         <w:spacing w:before="0" w:after="120" w:line="300" w:lineRule="auto"/>
@@ -8414,10 +8429,16 @@
               <w:bottom w:val="single" w:sz="6" w:space="0" w:color="000000"/>
               <w:right w:val="single" w:sz="6" w:space="0" w:color="000000"/>
             </w:tcBorders>
+            <w:tcMar>
+              <w:top w:w="60" w:type="dxa"/>
+              <w:bottom w:w="60" w:type="dxa"/>
+              <w:left w:w="120" w:type="dxa"/>
+              <w:right w:w="120" w:type="dxa"/>
+            </w:tcMar>
           </w:tcPr>
           <w:p>
             <w:pPr>
-              <w:spacing w:before="80" w:after="80" w:line="269" w:lineRule="auto"/>
+              <w:spacing w:before="40" w:after="40" w:line="269" w:lineRule="auto"/>
             </w:pPr>
             <w:r>
               <w:rPr>
@@ -8433,11 +8454,6 @@
         </w:tc>
       </w:tr>
     </w:tbl>
-    <w:p>
-      <w:pPr>
-        <w:spacing w:before="0" w:after="80"/>
-      </w:pPr>
-    </w:p>
     <w:p>
       <w:pPr>
         <w:spacing w:before="0" w:after="120" w:line="300" w:lineRule="auto"/>
@@ -8498,10 +8514,16 @@
               <w:bottom w:val="single" w:sz="6" w:space="0" w:color="000000"/>
               <w:right w:val="single" w:sz="6" w:space="0" w:color="000000"/>
             </w:tcBorders>
+            <w:tcMar>
+              <w:top w:w="60" w:type="dxa"/>
+              <w:bottom w:w="60" w:type="dxa"/>
+              <w:left w:w="120" w:type="dxa"/>
+              <w:right w:w="120" w:type="dxa"/>
+            </w:tcMar>
           </w:tcPr>
           <w:p>
             <w:pPr>
-              <w:spacing w:before="80" w:after="80" w:line="269" w:lineRule="auto"/>
+              <w:spacing w:before="40" w:after="40" w:line="269" w:lineRule="auto"/>
             </w:pPr>
             <w:r>
               <w:rPr>
@@ -8519,11 +8541,6 @@
         </w:tc>
       </w:tr>
     </w:tbl>
-    <w:p>
-      <w:pPr>
-        <w:spacing w:before="0" w:after="80"/>
-      </w:pPr>
-    </w:p>
     <w:p>
       <w:pPr>
         <w:spacing w:before="0" w:after="120" w:line="300" w:lineRule="auto"/>
@@ -8584,10 +8601,16 @@
               <w:bottom w:val="single" w:sz="6" w:space="0" w:color="000000"/>
               <w:right w:val="single" w:sz="6" w:space="0" w:color="000000"/>
             </w:tcBorders>
+            <w:tcMar>
+              <w:top w:w="60" w:type="dxa"/>
+              <w:bottom w:w="60" w:type="dxa"/>
+              <w:left w:w="120" w:type="dxa"/>
+              <w:right w:w="120" w:type="dxa"/>
+            </w:tcMar>
           </w:tcPr>
           <w:p>
             <w:pPr>
-              <w:spacing w:before="80" w:after="80" w:line="269" w:lineRule="auto"/>
+              <w:spacing w:before="40" w:after="40" w:line="269" w:lineRule="auto"/>
             </w:pPr>
             <w:r>
               <w:rPr>
@@ -8601,11 +8624,6 @@
         </w:tc>
       </w:tr>
     </w:tbl>
-    <w:p>
-      <w:pPr>
-        <w:spacing w:before="0" w:after="80"/>
-      </w:pPr>
-    </w:p>
     <w:p>
       <w:pPr>
         <w:spacing w:before="0" w:after="120" w:line="300" w:lineRule="auto"/>

</xml_diff>

<commit_message>
Replace all occurrences of suryah with riddhiman across project report and presentation
</commit_message>
<xml_diff>
--- a/BMS.docx
+++ b/BMS.docx
@@ -4664,7 +4664,7 @@
               <w:t>enter your choice = 1</w:t>
               <w:br/>
               <w:br/>
-              <w:t>Enter a Username = suryah</w:t>
+              <w:t>Enter a Username = riddhiman</w:t>
               <w:br/>
               <w:t>Enter a 4 DIGIT Password = 1298</w:t>
               <w:br/>
@@ -4766,7 +4766,7 @@
               <w:t>enter your choice = 2</w:t>
               <w:br/>
               <w:br/>
-              <w:t>Enter your Username = suryah</w:t>
+              <w:t>Enter your Username = riddhiman</w:t>
               <w:br/>
               <w:t>Enter your 4 DIGIT Password = 1298</w:t>
               <w:br/>
@@ -5868,7 +5868,7 @@
                 <w:color w:val="000000"/>
                 <w:sz w:val="19"/>
               </w:rPr>
-              <w:t>suryah, 1298</w:t>
+              <w:t>riddhiman, 1298</w:t>
             </w:r>
           </w:p>
         </w:tc>
@@ -6023,7 +6023,7 @@
                 <w:color w:val="000000"/>
                 <w:sz w:val="19"/>
               </w:rPr>
-              <w:t>suryah, 1298</w:t>
+              <w:t>riddhiman, 1298</w:t>
             </w:r>
           </w:p>
         </w:tc>
@@ -6178,7 +6178,7 @@
                 <w:color w:val="000000"/>
                 <w:sz w:val="19"/>
               </w:rPr>
-              <w:t>suryah, 9999</w:t>
+              <w:t>riddhiman, 9999</w:t>
             </w:r>
           </w:p>
         </w:tc>

</xml_diff>